<commit_message>
Maitê Proença: revisão da parte 2
Co-Authored-By: Claude Opus 5.5 <noreply@anthropic.com>
Claude-Session: https://claude.ai/code/session_01MJjUEEZrxQDEUifKK2vj9g
</commit_message>
<xml_diff>
--- a/roteiros/maite-proenca/MaiteProenca_Parte2.docx
+++ b/roteiros/maite-proenca/MaiteProenca_Parte2.docx
@@ -127,7 +127,7 @@
         <w:rPr>
           <w:color w:val="000000"/>
         </w:rPr>
-        <w:t>Augusto abriu a porta. E fugiu, levando a arma com ele.</w:t>
+        <w:t>Augusto fugiu, levando a arma com ele.</w:t>
       </w:r>
     </w:p>
     <w:p>
@@ -135,7 +135,7 @@
         <w:rPr>
           <w:color w:val="000000"/>
         </w:rPr>
-        <w:t>Dentro daquela casa ficaram o corpo de Margot e uma família que nunca mais ia ser a mesma. A menina que tinha crescido numa casa perfeita tinha doze anos.</w:t>
+        <w:t>Para trás ficaram o corpo de Margot e uma família que nunca mais ia ser a mesma. A menina que tinha crescido numa casa perfeita tinha doze anos.</w:t>
       </w:r>
     </w:p>
     <w:p>
@@ -151,7 +151,7 @@
         <w:rPr>
           <w:color w:val="000000"/>
         </w:rPr>
-        <w:t>Durante dias, ninguém sabia onde Augusto estava.</w:t>
+        <w:t>Durante dez dias, Augusto ficou foragido.</w:t>
       </w:r>
     </w:p>
     <w:p>
@@ -175,7 +175,7 @@
         <w:rPr>
           <w:color w:val="000000"/>
         </w:rPr>
-        <w:t>Dez dias depois do crime, Augusto reapareceu.</w:t>
+        <w:t>Até que reapareceu. Apresentou-se à polícia por conta própria. E não saiu dali preso.</w:t>
       </w:r>
     </w:p>
     <w:p>
@@ -183,15 +183,7 @@
         <w:rPr>
           <w:color w:val="000000"/>
         </w:rPr>
-        <w:t>Apresentou-se à polícia por conta própria. E não saiu dali preso.</w:t>
-      </w:r>
-    </w:p>
-    <w:p>
-      <w:r>
-        <w:rPr>
-          <w:color w:val="000000"/>
-        </w:rPr>
-        <w:t>Um homem que tinha matado a mulher com onze golpes de faca voltou para a rua para aguardar o julgamento em liberdade.</w:t>
+        <w:t>Um homem que tinha matado a mulher com onze golpes de faca se entregou e, mesmo assim, não foi para a cadeia naquele dia.</w:t>
       </w:r>
     </w:p>
     <w:p>
@@ -239,7 +231,7 @@
         <w:rPr>
           <w:color w:val="000000"/>
         </w:rPr>
-        <w:t>Anos depois, Maitê resumiria aquele momento com a palavra que marcou a vida dela: tudo desabou. Sem nenhuma preparação, sem nenhum aviso.</w:t>
+        <w:t>Anos depois, Maitê resumiria aquele momento assim: tudo desabou. Sem nenhuma preparação, sem nenhum aviso.</w:t>
       </w:r>
     </w:p>
     <w:p>
@@ -263,7 +255,7 @@
         <w:rPr>
           <w:color w:val="C00000"/>
         </w:rPr>
-        <w:t>Só que existe uma contradição nessa história que até hoje incomoda quem conhece o caso. Porque a mesma menina que tinha horror de encostar no pai ia sentar diante de um tribunal. E, na frente dos jurados, ia dizer exatamente o que a defesa dele precisava ouvir.</w:t>
+        <w:t>Só que existe uma contradição nessa história que é difícil de engolir. Porque a mesma menina que tinha horror de encostar no pai ia sentar diante de um tribunal. E, na frente dos jurados, ia dizer exatamente o que a defesa dele precisava ouvir.</w:t>
       </w:r>
     </w:p>
     <w:p>

</xml_diff>